<commit_message>
adding in response document detection
</commit_message>
<xml_diff>
--- a/templates/fujitsu_aic_plan_template.docx
+++ b/templates/fujitsu_aic_plan_template.docx
@@ -16,7 +16,7 @@
           <w:noProof/>
         </w:rPr>
         <w:drawing>
-          <wp:inline distT="0" distB="0" distL="0" distR="0" wp14:anchorId="5D73F287" wp14:editId="29FEB231">
+          <wp:inline distT="0" distB="0" distL="0" distR="0" wp14:anchorId="5D73F287" wp14:editId="3E572A1C">
             <wp:extent cx="590550" cy="180975"/>
             <wp:effectExtent l="0" t="0" r="0" b="0"/>
             <wp:docPr id="6" name="Picture 6"/>
@@ -131,73 +131,233 @@
         <w:pStyle w:val="TableofContents"/>
       </w:pPr>
     </w:p>
-    <w:p/>
-    <w:p>
-      <w:pPr>
-        <w:pStyle w:val="CoverHeadling"/>
-      </w:pPr>
-      <w:r>
-        <w:t>Fujitsu Response to {</w:t>
-      </w:r>
-      <w:proofErr w:type="spellStart"/>
-      <w:r>
-        <w:t>tender_reference</w:t>
-      </w:r>
-      <w:proofErr w:type="spellEnd"/>
-      <w:r>
-        <w:t>}</w:t>
-      </w:r>
-    </w:p>
-    <w:p>
-      <w:pPr>
-        <w:pStyle w:val="CoverHeadling"/>
-        <w:rPr>
-          <w:sz w:val="28"/>
-          <w:szCs w:val="28"/>
-        </w:rPr>
-      </w:pPr>
-    </w:p>
-    <w:p>
-      <w:pPr>
-        <w:pStyle w:val="CoverHeadling"/>
-        <w:rPr>
-          <w:sz w:val="28"/>
-          <w:szCs w:val="28"/>
-        </w:rPr>
-      </w:pPr>
-    </w:p>
-    <w:p>
-      <w:pPr>
-        <w:pStyle w:val="CoverHeadling"/>
-        <w:rPr>
-          <w:sz w:val="48"/>
-          <w:szCs w:val="48"/>
-        </w:rPr>
-      </w:pPr>
-      <w:r>
-        <w:rPr>
-          <w:rFonts w:ascii="Fujitsu Infinity Pro" w:hAnsi="Fujitsu Infinity Pro"/>
-          <w:sz w:val="48"/>
-          <w:szCs w:val="48"/>
-        </w:rPr>
-        <w:t>{</w:t>
-      </w:r>
-      <w:proofErr w:type="spellStart"/>
-      <w:r>
-        <w:rPr>
-          <w:sz w:val="48"/>
-          <w:szCs w:val="48"/>
-        </w:rPr>
-        <w:t>tender_title</w:t>
-      </w:r>
-      <w:proofErr w:type="spellEnd"/>
-      <w:r>
-        <w:rPr>
-          <w:rFonts w:ascii="Fujitsu Infinity Pro" w:hAnsi="Fujitsu Infinity Pro"/>
-          <w:sz w:val="48"/>
-          <w:szCs w:val="48"/>
-        </w:rPr>
-        <w:t>}</w:t>
+    <w:p>
+      <w:r>
+        <w:rPr>
+          <w:noProof/>
+          <w:lang w:eastAsia="en-GB"/>
+        </w:rPr>
+        <mc:AlternateContent>
+          <mc:Choice Requires="wps">
+            <w:drawing>
+              <wp:anchor distT="0" distB="0" distL="114300" distR="114300" simplePos="0" relativeHeight="251660293" behindDoc="0" locked="0" layoutInCell="1" allowOverlap="1" wp14:anchorId="39191482" wp14:editId="0D696814">
+                <wp:simplePos x="0" y="0"/>
+                <wp:positionH relativeFrom="margin">
+                  <wp:align>left</wp:align>
+                </wp:positionH>
+                <wp:positionV relativeFrom="paragraph">
+                  <wp:posOffset>14605</wp:posOffset>
+                </wp:positionV>
+                <wp:extent cx="3519170" cy="3058795"/>
+                <wp:effectExtent l="0" t="0" r="5080" b="6350"/>
+                <wp:wrapNone/>
+                <wp:docPr id="12" name="Text Box 30"/>
+                <wp:cNvGraphicFramePr>
+                  <a:graphicFrameLocks xmlns:a="http://schemas.openxmlformats.org/drawingml/2006/main"/>
+                </wp:cNvGraphicFramePr>
+                <a:graphic xmlns:a="http://schemas.openxmlformats.org/drawingml/2006/main">
+                  <a:graphicData uri="http://schemas.microsoft.com/office/word/2010/wordprocessingShape">
+                    <wps:wsp>
+                      <wps:cNvSpPr txBox="1">
+                        <a:spLocks noChangeArrowheads="1"/>
+                      </wps:cNvSpPr>
+                      <wps:spPr bwMode="auto">
+                        <a:xfrm>
+                          <a:off x="0" y="0"/>
+                          <a:ext cx="3519170" cy="3058795"/>
+                        </a:xfrm>
+                        <a:prstGeom prst="rect">
+                          <a:avLst/>
+                        </a:prstGeom>
+                        <a:noFill/>
+                        <a:ln>
+                          <a:noFill/>
+                        </a:ln>
+                        <a:extLst>
+                          <a:ext uri="{909E8E84-426E-40DD-AFC4-6F175D3DCCD1}">
+                            <a14:hiddenFill xmlns:a14="http://schemas.microsoft.com/office/drawing/2010/main">
+                              <a:solidFill>
+                                <a:srgbClr val="FFFFFF"/>
+                              </a:solidFill>
+                            </a14:hiddenFill>
+                          </a:ext>
+                          <a:ext uri="{91240B29-F687-4F45-9708-019B960494DF}">
+                            <a14:hiddenLine xmlns:a14="http://schemas.microsoft.com/office/drawing/2010/main" w="9525">
+                              <a:solidFill>
+                                <a:srgbClr val="000000"/>
+                              </a:solidFill>
+                              <a:miter lim="800000"/>
+                              <a:headEnd/>
+                              <a:tailEnd/>
+                            </a14:hiddenLine>
+                          </a:ext>
+                        </a:extLst>
+                      </wps:spPr>
+                      <wps:txbx>
+                        <w:txbxContent>
+                          <w:p>
+                            <w:pPr>
+                              <w:pStyle w:val="CoverHeadling"/>
+                            </w:pPr>
+                            <w:r>
+                              <w:t>Fujitsu Response to {</w:t>
+                            </w:r>
+                            <w:proofErr w:type="spellStart"/>
+                            <w:r>
+                              <w:t>tender_reference</w:t>
+                            </w:r>
+                            <w:proofErr w:type="spellEnd"/>
+                            <w:r>
+                              <w:t>}</w:t>
+                            </w:r>
+                          </w:p>
+                          <w:p>
+                            <w:pPr>
+                              <w:pStyle w:val="CoverHeadling"/>
+                              <w:rPr>
+                                <w:sz w:val="28"/>
+                                <w:szCs w:val="28"/>
+                              </w:rPr>
+                            </w:pPr>
+                          </w:p>
+                          <w:p>
+                            <w:pPr>
+                              <w:pStyle w:val="CoverHeadling"/>
+                              <w:rPr>
+                                <w:sz w:val="28"/>
+                                <w:szCs w:val="28"/>
+                              </w:rPr>
+                            </w:pPr>
+                          </w:p>
+                          <w:p>
+                            <w:pPr>
+                              <w:pStyle w:val="CoverHeadling"/>
+                              <w:rPr>
+                                <w:sz w:val="48"/>
+                                <w:szCs w:val="48"/>
+                              </w:rPr>
+                            </w:pPr>
+                            <w:r>
+                              <w:rPr>
+                                <w:rFonts w:ascii="Fujitsu Infinity Pro" w:hAnsi="Fujitsu Infinity Pro"/>
+                                <w:sz w:val="48"/>
+                                <w:szCs w:val="48"/>
+                              </w:rPr>
+                              <w:t>{</w:t>
+                            </w:r>
+                            <w:proofErr w:type="spellStart"/>
+                            <w:r>
+                              <w:rPr>
+                                <w:sz w:val="48"/>
+                                <w:szCs w:val="48"/>
+                              </w:rPr>
+                              <w:t>tender_title</w:t>
+                            </w:r>
+                            <w:proofErr w:type="spellEnd"/>
+                            <w:r>
+                              <w:rPr>
+                                <w:rFonts w:ascii="Fujitsu Infinity Pro" w:hAnsi="Fujitsu Infinity Pro"/>
+                                <w:sz w:val="48"/>
+                                <w:szCs w:val="48"/>
+                              </w:rPr>
+                              <w:t>}</w:t>
+                            </w:r>
+                          </w:p>
+                        </w:txbxContent>
+                      </wps:txbx>
+                      <wps:bodyPr rot="0" vert="horz" wrap="square" lIns="0" tIns="0" rIns="0" bIns="0" anchor="t" anchorCtr="0" upright="1">
+                        <a:spAutoFit/>
+                      </wps:bodyPr>
+                    </wps:wsp>
+                  </a:graphicData>
+                </a:graphic>
+              </wp:anchor>
+            </w:drawing>
+          </mc:Choice>
+          <mc:Fallback>
+            <w:pict>
+              <v:shapetype w14:anchorId="39191482" id="_x0000_t202" coordsize="21600,21600" o:spt="202" path="m,l,21600r21600,l21600,xe">
+                <v:stroke joinstyle="miter"/>
+                <v:path gradientshapeok="t" o:connecttype="rect"/>
+              </v:shapetype>
+              <v:shape id="Text Box 30" o:spid="_x0000_s1026" type="#_x0000_t202" style="position:absolute;margin-left:0;margin-top:1.15pt;width:277.1pt;height:240.85pt;z-index:251660293;visibility:visible;mso-wrap-style:square;mso-wrap-distance-left:9pt;mso-wrap-distance-top:0;mso-wrap-distance-right:9pt;mso-wrap-distance-bottom:0;mso-position-horizontal:left;mso-position-horizontal-relative:margin;mso-position-vertical:absolute;mso-position-vertical-relative:text;v-text-anchor:top" o:gfxdata="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" filled="f" stroked="f">
+                <v:textbox style="mso-fit-shape-to-text:t" inset="0,0,0,0">
+                  <w:txbxContent>
+                    <w:p>
+                      <w:pPr>
+                        <w:pStyle w:val="CoverHeadling"/>
+                      </w:pPr>
+                      <w:r>
+                        <w:t>Fujitsu Response to {</w:t>
+                      </w:r>
+                      <w:proofErr w:type="spellStart"/>
+                      <w:r>
+                        <w:t>tender_reference</w:t>
+                      </w:r>
+                      <w:proofErr w:type="spellEnd"/>
+                      <w:r>
+                        <w:t>}</w:t>
+                      </w:r>
+                    </w:p>
+                    <w:p>
+                      <w:pPr>
+                        <w:pStyle w:val="CoverHeadling"/>
+                        <w:rPr>
+                          <w:sz w:val="28"/>
+                          <w:szCs w:val="28"/>
+                        </w:rPr>
+                      </w:pPr>
+                    </w:p>
+                    <w:p>
+                      <w:pPr>
+                        <w:pStyle w:val="CoverHeadling"/>
+                        <w:rPr>
+                          <w:sz w:val="28"/>
+                          <w:szCs w:val="28"/>
+                        </w:rPr>
+                      </w:pPr>
+                    </w:p>
+                    <w:p>
+                      <w:pPr>
+                        <w:pStyle w:val="CoverHeadling"/>
+                        <w:rPr>
+                          <w:sz w:val="48"/>
+                          <w:szCs w:val="48"/>
+                        </w:rPr>
+                      </w:pPr>
+                      <w:r>
+                        <w:rPr>
+                          <w:rFonts w:ascii="Fujitsu Infinity Pro" w:hAnsi="Fujitsu Infinity Pro"/>
+                          <w:sz w:val="48"/>
+                          <w:szCs w:val="48"/>
+                        </w:rPr>
+                        <w:t>{</w:t>
+                      </w:r>
+                      <w:proofErr w:type="spellStart"/>
+                      <w:r>
+                        <w:rPr>
+                          <w:sz w:val="48"/>
+                          <w:szCs w:val="48"/>
+                        </w:rPr>
+                        <w:t>tender_title</w:t>
+                      </w:r>
+                      <w:proofErr w:type="spellEnd"/>
+                      <w:r>
+                        <w:rPr>
+                          <w:rFonts w:ascii="Fujitsu Infinity Pro" w:hAnsi="Fujitsu Infinity Pro"/>
+                          <w:sz w:val="48"/>
+                          <w:szCs w:val="48"/>
+                        </w:rPr>
+                        <w:t>}</w:t>
+                      </w:r>
+                    </w:p>
+                  </w:txbxContent>
+                </v:textbox>
+                <w10:wrap anchorx="margin"/>
+              </v:shape>
+            </w:pict>
+          </mc:Fallback>
+        </mc:AlternateContent>
       </w:r>
     </w:p>
     <w:p/>
@@ -341,11 +501,7 @@
           </mc:Choice>
           <mc:Fallback>
             <w:pict>
-              <v:shapetype w14:anchorId="0F8000A5" id="_x0000_t202" coordsize="21600,21600" o:spt="202" path="m,l,21600r21600,l21600,xe">
-                <v:stroke joinstyle="miter"/>
-                <v:path gradientshapeok="t" o:connecttype="rect"/>
-              </v:shapetype>
-              <v:shape id="Text Box 57" o:spid="_x0000_s1026" type="#_x0000_t202" style="position:absolute;margin-left:9pt;margin-top:621.7pt;width:268.15pt;height:110.55pt;z-index:251658244;visibility:visible;mso-wrap-style:square;mso-width-percent:0;mso-height-percent:0;mso-wrap-distance-left:9pt;mso-wrap-distance-top:0;mso-wrap-distance-right:9pt;mso-wrap-distance-bottom:0;mso-position-horizontal:absolute;mso-position-horizontal-relative:text;mso-position-vertical:absolute;mso-position-vertical-relative:page;mso-width-percent:0;mso-height-percent:0;mso-width-relative:page;mso-height-relative:page;v-text-anchor:top" o:gfxdata="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" o:allowincell="f" filled="f" stroked="f">
+              <v:shape w14:anchorId="0F8000A5" id="Text Box 57" o:spid="_x0000_s1027" type="#_x0000_t202" style="position:absolute;margin-left:9pt;margin-top:621.7pt;width:268.15pt;height:110.55pt;z-index:251658244;visibility:visible;mso-wrap-style:square;mso-width-percent:0;mso-height-percent:0;mso-wrap-distance-left:9pt;mso-wrap-distance-top:0;mso-wrap-distance-right:9pt;mso-wrap-distance-bottom:0;mso-position-horizontal:absolute;mso-position-horizontal-relative:text;mso-position-vertical:absolute;mso-position-vertical-relative:page;mso-width-percent:0;mso-height-percent:0;mso-width-relative:page;mso-height-relative:page;v-text-anchor:top" o:gfxdata="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" o:allowincell="f" filled="f" stroked="f">
                 <v:textbox style="mso-fit-shape-to-text:t" inset="0,0,0,0">
                   <w:txbxContent>
                     <w:p>
@@ -593,7 +749,7 @@
           </mc:Choice>
           <mc:Fallback>
             <w:pict>
-              <v:shape w14:anchorId="3CA5604E" id="Text Box 60" o:spid="_x0000_s1027" type="#_x0000_t202" style="position:absolute;margin-left:9pt;margin-top:790.5pt;width:302.15pt;height:18.7pt;z-index:251658245;visibility:visible;mso-wrap-style:square;mso-width-percent:0;mso-height-percent:0;mso-wrap-distance-left:9pt;mso-wrap-distance-top:0;mso-wrap-distance-right:9pt;mso-wrap-distance-bottom:0;mso-position-horizontal:absolute;mso-position-horizontal-relative:text;mso-position-vertical:absolute;mso-position-vertical-relative:page;mso-width-percent:0;mso-height-percent:0;mso-width-relative:page;mso-height-relative:page;v-text-anchor:bottom" o:gfxdata="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" o:allowincell="f" filled="f" stroked="f">
+              <v:shape w14:anchorId="3CA5604E" id="Text Box 60" o:spid="_x0000_s1028" type="#_x0000_t202" style="position:absolute;margin-left:9pt;margin-top:790.5pt;width:302.15pt;height:18.7pt;z-index:251658245;visibility:visible;mso-wrap-style:square;mso-width-percent:0;mso-height-percent:0;mso-wrap-distance-left:9pt;mso-wrap-distance-top:0;mso-wrap-distance-right:9pt;mso-wrap-distance-bottom:0;mso-position-horizontal:absolute;mso-position-horizontal-relative:text;mso-position-vertical:absolute;mso-position-vertical-relative:page;mso-width-percent:0;mso-height-percent:0;mso-width-relative:page;mso-height-relative:page;v-text-anchor:bottom" o:gfxdata="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" o:allowincell="f" filled="f" stroked="f">
                 <v:textbox style="mso-fit-shape-to-text:t" inset="0,0,0,0">
                   <w:txbxContent>
                     <w:p>
@@ -15004,7 +15160,7 @@
           </mc:Choice>
           <mc:Fallback>
             <w:pict>
-              <v:shape w14:anchorId="5FDAC5B4" id="Text Box 36" o:spid="_x0000_s1028" type="#_x0000_t202" style="position:absolute;margin-left:.95pt;margin-top:528.3pt;width:541.15pt;height:209.4pt;z-index:251658243;visibility:visible;mso-wrap-style:square;mso-width-percent:0;mso-height-percent:0;mso-wrap-distance-left:9pt;mso-wrap-distance-top:3.6pt;mso-wrap-distance-right:9pt;mso-wrap-distance-bottom:3.6pt;mso-position-horizontal:absolute;mso-position-horizontal-relative:text;mso-position-vertical:absolute;mso-position-vertical-relative:text;mso-width-percent:0;mso-height-percent:0;mso-width-relative:margin;mso-height-relative:margin;v-text-anchor:bottom" o:gfxdata="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" filled="f" stroked="f">
+              <v:shape w14:anchorId="5FDAC5B4" id="Text Box 36" o:spid="_x0000_s1029" type="#_x0000_t202" style="position:absolute;margin-left:.95pt;margin-top:528.3pt;width:541.15pt;height:209.4pt;z-index:251658243;visibility:visible;mso-wrap-style:square;mso-width-percent:0;mso-height-percent:0;mso-wrap-distance-left:9pt;mso-wrap-distance-top:3.6pt;mso-wrap-distance-right:9pt;mso-wrap-distance-bottom:3.6pt;mso-position-horizontal:absolute;mso-position-horizontal-relative:text;mso-position-vertical:absolute;mso-position-vertical-relative:text;mso-width-percent:0;mso-height-percent:0;mso-width-relative:margin;mso-height-relative:margin;v-text-anchor:bottom" o:gfxdata="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" filled="f" stroked="f">
                 <v:textbox>
                   <w:txbxContent>
                     <w:p>
@@ -15533,7 +15689,7 @@
               <v:stroke joinstyle="miter"/>
               <v:path gradientshapeok="t" o:connecttype="rect"/>
             </v:shapetype>
-            <v:shape id="_x0000_s1029" type="#_x0000_t202" style="position:absolute;left:0;text-align:left;margin-left:0;margin-top:794.1pt;width:302.15pt;height:18.7pt;z-index:251657216;visibility:visible;mso-wrap-style:square;mso-width-percent:0;mso-height-percent:0;mso-wrap-distance-left:9pt;mso-wrap-distance-top:0;mso-wrap-distance-right:9pt;mso-wrap-distance-bottom:0;mso-position-horizontal:absolute;mso-position-horizontal-relative:text;mso-position-vertical:absolute;mso-position-vertical-relative:page;mso-width-percent:0;mso-height-percent:0;mso-width-relative:page;mso-height-relative:page;v-text-anchor:bottom" o:gfxdata="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" o:allowincell="f" filled="f" stroked="f">
+            <v:shape id="_x0000_s1030" type="#_x0000_t202" style="position:absolute;left:0;text-align:left;margin-left:0;margin-top:794.1pt;width:302.15pt;height:18.7pt;z-index:251657216;visibility:visible;mso-wrap-style:square;mso-width-percent:0;mso-height-percent:0;mso-wrap-distance-left:9pt;mso-wrap-distance-top:0;mso-wrap-distance-right:9pt;mso-wrap-distance-bottom:0;mso-position-horizontal:absolute;mso-position-horizontal-relative:text;mso-position-vertical:absolute;mso-position-vertical-relative:page;mso-width-percent:0;mso-height-percent:0;mso-width-relative:page;mso-height-relative:page;v-text-anchor:bottom" o:gfxdata="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" o:allowincell="f" filled="f" stroked="f">
               <v:textbox style="mso-fit-shape-to-text:t" inset="0,0,0,0">
                 <w:txbxContent>
                   <w:p>
@@ -22742,7 +22898,7 @@
     <w:charset w:val="00"/>
     <w:family w:val="auto"/>
     <w:pitch w:val="variable"/>
-    <w:sig w:usb0="A000004F" w:usb1="0000005B" w:usb2="00000000" w:usb3="00000000" w:csb0="00000093" w:csb1="00000000"/>
+    <w:sig w:usb0="A000006F" w:usb1="0000005B" w:usb2="00000000" w:usb3="00000000" w:csb0="00000093" w:csb1="00000000"/>
   </w:font>
   <w:font w:name="Times New Roman">
     <w:panose1 w:val="02020603050405020304"/>
@@ -22960,6 +23116,7 @@
     <w:rsid w:val="009B573E"/>
     <w:rsid w:val="00A220B8"/>
     <w:rsid w:val="00AC5AF0"/>
+    <w:rsid w:val="00AD4E29"/>
     <w:rsid w:val="00B251C5"/>
     <w:rsid w:val="00B95D7F"/>
     <w:rsid w:val="00BB7D94"/>
@@ -23761,6 +23918,19 @@
 </file>
 
 <file path=customXml/item1.xml><?xml version="1.0" encoding="utf-8"?>
+<b:Sources xmlns:b="http://schemas.openxmlformats.org/officeDocument/2006/bibliography" xmlns="http://schemas.openxmlformats.org/officeDocument/2006/bibliography" SelectedStyle="\APASixthEditionOfficeOnline.xsl" StyleName="APA" Version="6"/>
+</file>
+
+<file path=customXml/item2.xml><?xml version="1.0" encoding="utf-8"?>
+<?mso-contentType ?>
+<FormTemplates xmlns="http://schemas.microsoft.com/sharepoint/v3/contenttype/forms">
+  <Display>DocumentLibraryForm</Display>
+  <Edit>DocumentLibraryForm</Edit>
+  <New>DocumentLibraryForm</New>
+</FormTemplates>
+</file>
+
+<file path=customXml/item3.xml><?xml version="1.0" encoding="utf-8"?>
 <?mso-contentType ?>
 <p:Policy xmlns:p="office.server.policy" id="" local="true">
   <p:Name>Document</p:Name>
@@ -23784,28 +23954,54 @@
 </p:Policy>
 </file>
 
-<file path=customXml/item2.xml><?xml version="1.0" encoding="utf-8"?>
+<file path=customXml/item4.xml><?xml version="1.0" encoding="utf-8"?>
 <?mso-contentType ?>
-<FormTemplates xmlns="http://schemas.microsoft.com/sharepoint/v3/contenttype/forms">
-  <Display>DocumentLibraryForm</Display>
-  <Edit>DocumentLibraryForm</Edit>
-  <New>DocumentLibraryForm</New>
-</FormTemplates>
-</file>
-
-<file path=customXml/item3.xml><?xml version="1.0" encoding="utf-8"?>
-<b:Sources xmlns:b="http://schemas.openxmlformats.org/officeDocument/2006/bibliography" xmlns="http://schemas.openxmlformats.org/officeDocument/2006/bibliography" SelectedStyle="\APASixthEditionOfficeOnline.xsl" StyleName="APA" Version="6"/>
-</file>
-
-<file path=customXml/item4.xml><?xml version="1.0" encoding="utf-8"?>
-<p:properties xmlns:p="http://schemas.microsoft.com/office/2006/metadata/properties" xmlns:xsi="http://www.w3.org/2001/XMLSchema-instance" xmlns:pc="http://schemas.microsoft.com/office/infopath/2007/PartnerControls">
-  <documentManagement>
-    <Client_x0020_Sales_x0020_Region xmlns="7f2c612f-2cae-471f-80f7-2730df43b7ae">FEDERAL GOVT</Client_x0020_Sales_x0020_Region>
-    <Bid_x0020_Document_x0020_Type xmlns="7f2c612f-2cae-471f-80f7-2730df43b7ae" xsi:nil="true"/>
-    <Opportunity_x0020__x0023_ xmlns="2f3b332e-b9dc-477b-975a-f99bd97059a4">FANZ-105342</Opportunity_x0020__x0023_>
-    <Client_x0020_Name xmlns="7f2c612f-2cae-471f-80f7-2730df43b7ae">Defence</Client_x0020_Name>
-  </documentManagement>
-</p:properties>
+<spe:Receivers xmlns:spe="http://schemas.microsoft.com/sharepoint/events">
+  <Receiver>
+    <Name>Policy Auditing</Name>
+    <Synchronization>Synchronous</Synchronization>
+    <Type>10001</Type>
+    <SequenceNumber>1100</SequenceNumber>
+    <Url/>
+    <Assembly>Microsoft.Office.Policy, Version=16.0.0.0, Culture=neutral, PublicKeyToken=71e9bce111e9429c</Assembly>
+    <Class>Microsoft.Office.RecordsManagement.Internal.AuditHandler</Class>
+    <Data/>
+    <Filter/>
+  </Receiver>
+  <Receiver>
+    <Name>Policy Auditing</Name>
+    <Synchronization>Synchronous</Synchronization>
+    <Type>10002</Type>
+    <SequenceNumber>1101</SequenceNumber>
+    <Url/>
+    <Assembly>Microsoft.Office.Policy, Version=16.0.0.0, Culture=neutral, PublicKeyToken=71e9bce111e9429c</Assembly>
+    <Class>Microsoft.Office.RecordsManagement.Internal.AuditHandler</Class>
+    <Data/>
+    <Filter/>
+  </Receiver>
+  <Receiver>
+    <Name>Policy Auditing</Name>
+    <Synchronization>Synchronous</Synchronization>
+    <Type>10004</Type>
+    <SequenceNumber>1102</SequenceNumber>
+    <Url/>
+    <Assembly>Microsoft.Office.Policy, Version=16.0.0.0, Culture=neutral, PublicKeyToken=71e9bce111e9429c</Assembly>
+    <Class>Microsoft.Office.RecordsManagement.Internal.AuditHandler</Class>
+    <Data/>
+    <Filter/>
+  </Receiver>
+  <Receiver>
+    <Name>Policy Auditing</Name>
+    <Synchronization>Synchronous</Synchronization>
+    <Type>10006</Type>
+    <SequenceNumber>1103</SequenceNumber>
+    <Url/>
+    <Assembly>Microsoft.Office.Policy, Version=16.0.0.0, Culture=neutral, PublicKeyToken=71e9bce111e9429c</Assembly>
+    <Class>Microsoft.Office.RecordsManagement.Internal.AuditHandler</Class>
+    <Data/>
+    <Filter/>
+  </Receiver>
+</spe:Receivers>
 </file>
 
 <file path=customXml/item5.xml><?xml version="1.0" encoding="utf-8"?>
@@ -24037,59 +24233,20 @@
 </file>
 
 <file path=customXml/item6.xml><?xml version="1.0" encoding="utf-8"?>
-<?mso-contentType ?>
-<spe:Receivers xmlns:spe="http://schemas.microsoft.com/sharepoint/events">
-  <Receiver>
-    <Name>Policy Auditing</Name>
-    <Synchronization>Synchronous</Synchronization>
-    <Type>10001</Type>
-    <SequenceNumber>1100</SequenceNumber>
-    <Url/>
-    <Assembly>Microsoft.Office.Policy, Version=16.0.0.0, Culture=neutral, PublicKeyToken=71e9bce111e9429c</Assembly>
-    <Class>Microsoft.Office.RecordsManagement.Internal.AuditHandler</Class>
-    <Data/>
-    <Filter/>
-  </Receiver>
-  <Receiver>
-    <Name>Policy Auditing</Name>
-    <Synchronization>Synchronous</Synchronization>
-    <Type>10002</Type>
-    <SequenceNumber>1101</SequenceNumber>
-    <Url/>
-    <Assembly>Microsoft.Office.Policy, Version=16.0.0.0, Culture=neutral, PublicKeyToken=71e9bce111e9429c</Assembly>
-    <Class>Microsoft.Office.RecordsManagement.Internal.AuditHandler</Class>
-    <Data/>
-    <Filter/>
-  </Receiver>
-  <Receiver>
-    <Name>Policy Auditing</Name>
-    <Synchronization>Synchronous</Synchronization>
-    <Type>10004</Type>
-    <SequenceNumber>1102</SequenceNumber>
-    <Url/>
-    <Assembly>Microsoft.Office.Policy, Version=16.0.0.0, Culture=neutral, PublicKeyToken=71e9bce111e9429c</Assembly>
-    <Class>Microsoft.Office.RecordsManagement.Internal.AuditHandler</Class>
-    <Data/>
-    <Filter/>
-  </Receiver>
-  <Receiver>
-    <Name>Policy Auditing</Name>
-    <Synchronization>Synchronous</Synchronization>
-    <Type>10006</Type>
-    <SequenceNumber>1103</SequenceNumber>
-    <Url/>
-    <Assembly>Microsoft.Office.Policy, Version=16.0.0.0, Culture=neutral, PublicKeyToken=71e9bce111e9429c</Assembly>
-    <Class>Microsoft.Office.RecordsManagement.Internal.AuditHandler</Class>
-    <Data/>
-    <Filter/>
-  </Receiver>
-</spe:Receivers>
+<p:properties xmlns:p="http://schemas.microsoft.com/office/2006/metadata/properties" xmlns:xsi="http://www.w3.org/2001/XMLSchema-instance" xmlns:pc="http://schemas.microsoft.com/office/infopath/2007/PartnerControls">
+  <documentManagement>
+    <Client_x0020_Sales_x0020_Region xmlns="7f2c612f-2cae-471f-80f7-2730df43b7ae">FEDERAL GOVT</Client_x0020_Sales_x0020_Region>
+    <Bid_x0020_Document_x0020_Type xmlns="7f2c612f-2cae-471f-80f7-2730df43b7ae" xsi:nil="true"/>
+    <Opportunity_x0020__x0023_ xmlns="2f3b332e-b9dc-477b-975a-f99bd97059a4">FANZ-105342</Opportunity_x0020__x0023_>
+    <Client_x0020_Name xmlns="7f2c612f-2cae-471f-80f7-2730df43b7ae">Defence</Client_x0020_Name>
+  </documentManagement>
+</p:properties>
 </file>
 
 <file path=customXml/itemProps1.xml><?xml version="1.0" encoding="utf-8"?>
-<ds:datastoreItem xmlns:ds="http://schemas.openxmlformats.org/officeDocument/2006/customXml" ds:itemID="{E15BC738-575E-40F3-9297-E819E05AF672}">
+<ds:datastoreItem xmlns:ds="http://schemas.openxmlformats.org/officeDocument/2006/customXml" ds:itemID="{098FA049-8932-46C8-8E9F-8E405EDCC574}">
   <ds:schemaRefs>
-    <ds:schemaRef ds:uri="office.server.policy"/>
+    <ds:schemaRef ds:uri="http://schemas.openxmlformats.org/officeDocument/2006/bibliography"/>
   </ds:schemaRefs>
 </ds:datastoreItem>
 </file>
@@ -24103,20 +24260,17 @@
 </file>
 
 <file path=customXml/itemProps3.xml><?xml version="1.0" encoding="utf-8"?>
-<ds:datastoreItem xmlns:ds="http://schemas.openxmlformats.org/officeDocument/2006/customXml" ds:itemID="{098FA049-8932-46C8-8E9F-8E405EDCC574}">
+<ds:datastoreItem xmlns:ds="http://schemas.openxmlformats.org/officeDocument/2006/customXml" ds:itemID="{E15BC738-575E-40F3-9297-E819E05AF672}">
   <ds:schemaRefs>
-    <ds:schemaRef ds:uri="http://schemas.openxmlformats.org/officeDocument/2006/bibliography"/>
+    <ds:schemaRef ds:uri="office.server.policy"/>
   </ds:schemaRefs>
 </ds:datastoreItem>
 </file>
 
 <file path=customXml/itemProps4.xml><?xml version="1.0" encoding="utf-8"?>
-<ds:datastoreItem xmlns:ds="http://schemas.openxmlformats.org/officeDocument/2006/customXml" ds:itemID="{334E9B40-50FB-4CF3-9BE5-5BE92281D75E}">
+<ds:datastoreItem xmlns:ds="http://schemas.openxmlformats.org/officeDocument/2006/customXml" ds:itemID="{D74C4DB1-7C9F-45F3-A75C-A58C871BAA63}">
   <ds:schemaRefs>
-    <ds:schemaRef ds:uri="http://schemas.microsoft.com/office/2006/metadata/properties"/>
-    <ds:schemaRef ds:uri="http://schemas.microsoft.com/office/infopath/2007/PartnerControls"/>
-    <ds:schemaRef ds:uri="7f2c612f-2cae-471f-80f7-2730df43b7ae"/>
-    <ds:schemaRef ds:uri="2f3b332e-b9dc-477b-975a-f99bd97059a4"/>
+    <ds:schemaRef ds:uri="http://schemas.microsoft.com/sharepoint/events"/>
   </ds:schemaRefs>
 </ds:datastoreItem>
 </file>
@@ -24143,9 +24297,12 @@
 </file>
 
 <file path=customXml/itemProps6.xml><?xml version="1.0" encoding="utf-8"?>
-<ds:datastoreItem xmlns:ds="http://schemas.openxmlformats.org/officeDocument/2006/customXml" ds:itemID="{D74C4DB1-7C9F-45F3-A75C-A58C871BAA63}">
+<ds:datastoreItem xmlns:ds="http://schemas.openxmlformats.org/officeDocument/2006/customXml" ds:itemID="{334E9B40-50FB-4CF3-9BE5-5BE92281D75E}">
   <ds:schemaRefs>
-    <ds:schemaRef ds:uri="http://schemas.microsoft.com/sharepoint/events"/>
+    <ds:schemaRef ds:uri="http://schemas.microsoft.com/office/2006/metadata/properties"/>
+    <ds:schemaRef ds:uri="http://schemas.microsoft.com/office/infopath/2007/PartnerControls"/>
+    <ds:schemaRef ds:uri="7f2c612f-2cae-471f-80f7-2730df43b7ae"/>
+    <ds:schemaRef ds:uri="2f3b332e-b9dc-477b-975a-f99bd97059a4"/>
   </ds:schemaRefs>
 </ds:datastoreItem>
 </file>
</xml_diff>